<commit_message>
Reemplazar bloques de codigo por imagenes estilo editor
</commit_message>
<xml_diff>
--- a/Solucion_Taller_Analisis_Algoritmos_Iterativos.docx
+++ b/Solucion_Taller_Analisis_Algoritmos_Iterativos.docx
@@ -194,158 +194,43 @@
     </w:p>
     <w:p>
       <w:pPr>
-        <w:shd w:val="clear" w:color="auto" w:fill="F2F2F2"/>
-      </w:pPr>
-      <w:r>
-        <w:rPr>
-          <w:rFonts w:ascii="Consolas" w:eastAsia="Consolas" w:hAnsi="Consolas" w:cs="Consolas"/>
-          <w:sz w:val="19"/>
-          <w:szCs w:val="19"/>
-        </w:rPr>
-        <w:t>function item1(a){</w:t>
-      </w:r>
-    </w:p>
-    <w:p>
-      <w:pPr>
-        <w:shd w:val="clear" w:color="auto" w:fill="F2F2F2"/>
-      </w:pPr>
-      <w:r>
-        <w:rPr>
-          <w:rFonts w:ascii="Consolas" w:eastAsia="Consolas" w:hAnsi="Consolas" w:cs="Consolas"/>
-          <w:sz w:val="19"/>
-          <w:szCs w:val="19"/>
-        </w:rPr>
-        <w:t xml:space="preserve">    let res ="Si se cumple";</w:t>
-      </w:r>
-    </w:p>
-    <w:p>
-      <w:pPr>
-        <w:shd w:val="clear" w:color="auto" w:fill="F2F2F2"/>
-      </w:pPr>
-      <w:r>
-        <w:rPr>
-          <w:rFonts w:ascii="Consolas" w:eastAsia="Consolas" w:hAnsi="Consolas" w:cs="Consolas"/>
-          <w:sz w:val="19"/>
-          <w:szCs w:val="19"/>
-        </w:rPr>
-        <w:t xml:space="preserve">    let final = a.length-1;</w:t>
-      </w:r>
-    </w:p>
-    <w:p>
-      <w:pPr>
-        <w:shd w:val="clear" w:color="auto" w:fill="F2F2F2"/>
-      </w:pPr>
-      <w:r>
-        <w:rPr>
-          <w:rFonts w:ascii="Consolas" w:eastAsia="Consolas" w:hAnsi="Consolas" w:cs="Consolas"/>
-          <w:sz w:val="19"/>
-          <w:szCs w:val="19"/>
-        </w:rPr>
-        <w:t xml:space="preserve">    for(let i=0; i&lt;a.length/2; i++){</w:t>
-      </w:r>
-    </w:p>
-    <w:p>
-      <w:pPr>
-        <w:shd w:val="clear" w:color="auto" w:fill="F2F2F2"/>
-      </w:pPr>
-      <w:r>
-        <w:rPr>
-          <w:rFonts w:ascii="Consolas" w:eastAsia="Consolas" w:hAnsi="Consolas" w:cs="Consolas"/>
-          <w:sz w:val="19"/>
-          <w:szCs w:val="19"/>
-        </w:rPr>
-        <w:t xml:space="preserve">        if (a[i] != a[final]){</w:t>
-      </w:r>
-    </w:p>
-    <w:p>
-      <w:pPr>
-        <w:shd w:val="clear" w:color="auto" w:fill="F2F2F2"/>
-      </w:pPr>
-      <w:r>
-        <w:rPr>
-          <w:rFonts w:ascii="Consolas" w:eastAsia="Consolas" w:hAnsi="Consolas" w:cs="Consolas"/>
-          <w:sz w:val="19"/>
-          <w:szCs w:val="19"/>
-        </w:rPr>
-        <w:t xml:space="preserve">            res ="no se cumple";</w:t>
-      </w:r>
-    </w:p>
-    <w:p>
-      <w:pPr>
-        <w:shd w:val="clear" w:color="auto" w:fill="F2F2F2"/>
-      </w:pPr>
-      <w:r>
-        <w:rPr>
-          <w:rFonts w:ascii="Consolas" w:eastAsia="Consolas" w:hAnsi="Consolas" w:cs="Consolas"/>
-          <w:sz w:val="19"/>
-          <w:szCs w:val="19"/>
-        </w:rPr>
-        <w:t xml:space="preserve">            break;</w:t>
-      </w:r>
-    </w:p>
-    <w:p>
-      <w:pPr>
-        <w:shd w:val="clear" w:color="auto" w:fill="F2F2F2"/>
-      </w:pPr>
-      <w:r>
-        <w:rPr>
-          <w:rFonts w:ascii="Consolas" w:eastAsia="Consolas" w:hAnsi="Consolas" w:cs="Consolas"/>
-          <w:sz w:val="19"/>
-          <w:szCs w:val="19"/>
-        </w:rPr>
-        <w:t xml:space="preserve">        }</w:t>
-      </w:r>
-    </w:p>
-    <w:p>
-      <w:pPr>
-        <w:shd w:val="clear" w:color="auto" w:fill="F2F2F2"/>
-      </w:pPr>
-      <w:r>
-        <w:rPr>
-          <w:rFonts w:ascii="Consolas" w:eastAsia="Consolas" w:hAnsi="Consolas" w:cs="Consolas"/>
-          <w:sz w:val="19"/>
-          <w:szCs w:val="19"/>
-        </w:rPr>
-        <w:t xml:space="preserve">        final--</w:t>
-      </w:r>
-    </w:p>
-    <w:p>
-      <w:pPr>
-        <w:shd w:val="clear" w:color="auto" w:fill="F2F2F2"/>
-      </w:pPr>
-      <w:r>
-        <w:rPr>
-          <w:rFonts w:ascii="Consolas" w:eastAsia="Consolas" w:hAnsi="Consolas" w:cs="Consolas"/>
-          <w:sz w:val="19"/>
-          <w:szCs w:val="19"/>
-        </w:rPr>
-        <w:t xml:space="preserve">    }</w:t>
-      </w:r>
-    </w:p>
-    <w:p>
-      <w:pPr>
-        <w:shd w:val="clear" w:color="auto" w:fill="F2F2F2"/>
-      </w:pPr>
-      <w:r>
-        <w:rPr>
-          <w:rFonts w:ascii="Consolas" w:eastAsia="Consolas" w:hAnsi="Consolas" w:cs="Consolas"/>
-          <w:sz w:val="19"/>
-          <w:szCs w:val="19"/>
-        </w:rPr>
-        <w:t xml:space="preserve">    return res;</w:t>
-      </w:r>
-    </w:p>
-    <w:p>
-      <w:pPr>
-        <w:shd w:val="clear" w:color="auto" w:fill="F2F2F2"/>
-      </w:pPr>
-      <w:r>
-        <w:rPr>
-          <w:rFonts w:ascii="Consolas" w:eastAsia="Consolas" w:hAnsi="Consolas" w:cs="Consolas"/>
-          <w:sz w:val="19"/>
-          <w:szCs w:val="19"/>
-        </w:rPr>
-        <w:t>}</w:t>
+        <w:keepLines/>
+        <w:spacing w:after="86"/>
+        <w:jc w:val="center"/>
+      </w:pPr>
+      <w:r>
+        <w:drawing>
+          <wp:inline xmlns:a="http://schemas.openxmlformats.org/drawingml/2006/main" xmlns:pic="http://schemas.openxmlformats.org/drawingml/2006/picture">
+            <wp:extent cx="5227319" cy="2949701"/>
+            <wp:docPr id="1" name="Picture 1"/>
+            <wp:cNvGraphicFramePr>
+              <a:graphicFrameLocks noChangeAspect="1"/>
+            </wp:cNvGraphicFramePr>
+            <a:graphic>
+              <a:graphicData uri="http://schemas.openxmlformats.org/drawingml/2006/picture">
+                <pic:pic>
+                  <pic:nvPicPr>
+                    <pic:cNvPr id="0" name="c0_0.png"/>
+                    <pic:cNvPicPr/>
+                  </pic:nvPicPr>
+                  <pic:blipFill>
+                    <a:blip r:embed="rId7"/>
+                    <a:stretch>
+                      <a:fillRect/>
+                    </a:stretch>
+                  </pic:blipFill>
+                  <pic:spPr>
+                    <a:xfrm>
+                      <a:off x="0" y="0"/>
+                      <a:ext cx="5227319" cy="2949701"/>
+                    </a:xfrm>
+                    <a:prstGeom prst="rect"/>
+                  </pic:spPr>
+                </pic:pic>
+              </a:graphicData>
+            </a:graphic>
+          </wp:inline>
+        </w:drawing>
       </w:r>
     </w:p>
     <w:p>
@@ -413,211 +298,43 @@
     </w:p>
     <w:p>
       <w:pPr>
-        <w:shd w:val="clear" w:color="auto" w:fill="F2F2F2"/>
-      </w:pPr>
-      <w:r>
-        <w:rPr>
-          <w:rFonts w:ascii="Consolas" w:eastAsia="Consolas" w:hAnsi="Consolas" w:cs="Consolas"/>
-          <w:sz w:val="19"/>
-          <w:szCs w:val="19"/>
-        </w:rPr>
-        <w:t>function item2(n){</w:t>
-      </w:r>
-    </w:p>
-    <w:p>
-      <w:pPr>
-        <w:shd w:val="clear" w:color="auto" w:fill="F2F2F2"/>
-      </w:pPr>
-      <w:r>
-        <w:rPr>
-          <w:rFonts w:ascii="Consolas" w:eastAsia="Consolas" w:hAnsi="Consolas" w:cs="Consolas"/>
-          <w:sz w:val="19"/>
-          <w:szCs w:val="19"/>
-        </w:rPr>
-        <w:t xml:space="preserve">    let tope = Math.floor(Math.sqrt(n));</w:t>
-      </w:r>
-    </w:p>
-    <w:p>
-      <w:pPr>
-        <w:shd w:val="clear" w:color="auto" w:fill="F2F2F2"/>
-      </w:pPr>
-      <w:r>
-        <w:rPr>
-          <w:rFonts w:ascii="Consolas" w:eastAsia="Consolas" w:hAnsi="Consolas" w:cs="Consolas"/>
-          <w:sz w:val="19"/>
-          <w:szCs w:val="19"/>
-        </w:rPr>
-        <w:lastRenderedPageBreak/>
-        <w:t xml:space="preserve">    let res = true;</w:t>
-      </w:r>
-    </w:p>
-    <w:p>
-      <w:pPr>
-        <w:shd w:val="clear" w:color="auto" w:fill="F2F2F2"/>
-      </w:pPr>
-      <w:r>
-        <w:rPr>
-          <w:rFonts w:ascii="Consolas" w:eastAsia="Consolas" w:hAnsi="Consolas" w:cs="Consolas"/>
-          <w:sz w:val="19"/>
-          <w:szCs w:val="19"/>
-        </w:rPr>
-        <w:t xml:space="preserve"> </w:t>
-      </w:r>
-    </w:p>
-    <w:p>
-      <w:pPr>
-        <w:shd w:val="clear" w:color="auto" w:fill="F2F2F2"/>
-      </w:pPr>
-      <w:r>
-        <w:rPr>
-          <w:rFonts w:ascii="Consolas" w:eastAsia="Consolas" w:hAnsi="Consolas" w:cs="Consolas"/>
-          <w:sz w:val="19"/>
-          <w:szCs w:val="19"/>
-        </w:rPr>
-        <w:t xml:space="preserve">    for(let i=2; i&lt;=tope; i++){</w:t>
-      </w:r>
-    </w:p>
-    <w:p>
-      <w:pPr>
-        <w:shd w:val="clear" w:color="auto" w:fill="F2F2F2"/>
-      </w:pPr>
-      <w:r>
-        <w:rPr>
-          <w:rFonts w:ascii="Consolas" w:eastAsia="Consolas" w:hAnsi="Consolas" w:cs="Consolas"/>
-          <w:sz w:val="19"/>
-          <w:szCs w:val="19"/>
-        </w:rPr>
-        <w:t xml:space="preserve">        if (n%i==0){</w:t>
-      </w:r>
-    </w:p>
-    <w:p>
-      <w:pPr>
-        <w:shd w:val="clear" w:color="auto" w:fill="F2F2F2"/>
-      </w:pPr>
-      <w:r>
-        <w:rPr>
-          <w:rFonts w:ascii="Consolas" w:eastAsia="Consolas" w:hAnsi="Consolas" w:cs="Consolas"/>
-          <w:sz w:val="19"/>
-          <w:szCs w:val="19"/>
-        </w:rPr>
-        <w:t xml:space="preserve">            res =false;</w:t>
-      </w:r>
-    </w:p>
-    <w:p>
-      <w:pPr>
-        <w:shd w:val="clear" w:color="auto" w:fill="F2F2F2"/>
-      </w:pPr>
-      <w:r>
-        <w:rPr>
-          <w:rFonts w:ascii="Consolas" w:eastAsia="Consolas" w:hAnsi="Consolas" w:cs="Consolas"/>
-          <w:sz w:val="19"/>
-          <w:szCs w:val="19"/>
-        </w:rPr>
-        <w:t xml:space="preserve">            break;</w:t>
-      </w:r>
-    </w:p>
-    <w:p>
-      <w:pPr>
-        <w:shd w:val="clear" w:color="auto" w:fill="F2F2F2"/>
-      </w:pPr>
-      <w:r>
-        <w:rPr>
-          <w:rFonts w:ascii="Consolas" w:eastAsia="Consolas" w:hAnsi="Consolas" w:cs="Consolas"/>
-          <w:sz w:val="19"/>
-          <w:szCs w:val="19"/>
-        </w:rPr>
-        <w:t xml:space="preserve">        }</w:t>
-      </w:r>
-    </w:p>
-    <w:p>
-      <w:pPr>
-        <w:shd w:val="clear" w:color="auto" w:fill="F2F2F2"/>
-      </w:pPr>
-      <w:r>
-        <w:rPr>
-          <w:rFonts w:ascii="Consolas" w:eastAsia="Consolas" w:hAnsi="Consolas" w:cs="Consolas"/>
-          <w:sz w:val="19"/>
-          <w:szCs w:val="19"/>
-        </w:rPr>
-        <w:t xml:space="preserve">    }</w:t>
-      </w:r>
-    </w:p>
-    <w:p>
-      <w:pPr>
-        <w:shd w:val="clear" w:color="auto" w:fill="F2F2F2"/>
-      </w:pPr>
-      <w:r>
-        <w:rPr>
-          <w:rFonts w:ascii="Consolas" w:eastAsia="Consolas" w:hAnsi="Consolas" w:cs="Consolas"/>
-          <w:sz w:val="19"/>
-          <w:szCs w:val="19"/>
-        </w:rPr>
-        <w:t xml:space="preserve">    return res;</w:t>
-      </w:r>
-    </w:p>
-    <w:p>
-      <w:pPr>
-        <w:shd w:val="clear" w:color="auto" w:fill="F2F2F2"/>
-      </w:pPr>
-      <w:r>
-        <w:rPr>
-          <w:rFonts w:ascii="Consolas" w:eastAsia="Consolas" w:hAnsi="Consolas" w:cs="Consolas"/>
-          <w:sz w:val="19"/>
-          <w:szCs w:val="19"/>
-        </w:rPr>
-        <w:t>}</w:t>
-      </w:r>
-    </w:p>
-    <w:p>
-      <w:pPr>
-        <w:shd w:val="clear" w:color="auto" w:fill="F2F2F2"/>
-      </w:pPr>
-      <w:r>
-        <w:rPr>
-          <w:rFonts w:ascii="Consolas" w:eastAsia="Consolas" w:hAnsi="Consolas" w:cs="Consolas"/>
-          <w:sz w:val="19"/>
-          <w:szCs w:val="19"/>
-        </w:rPr>
-        <w:t xml:space="preserve"> </w:t>
-      </w:r>
-    </w:p>
-    <w:p>
-      <w:pPr>
-        <w:shd w:val="clear" w:color="auto" w:fill="F2F2F2"/>
-      </w:pPr>
-      <w:r>
-        <w:rPr>
-          <w:rFonts w:ascii="Consolas" w:eastAsia="Consolas" w:hAnsi="Consolas" w:cs="Consolas"/>
-          <w:sz w:val="19"/>
-          <w:szCs w:val="19"/>
-        </w:rPr>
-        <w:t>for (let pos=2; pos&lt;=20; pos++){</w:t>
-      </w:r>
-    </w:p>
-    <w:p>
-      <w:pPr>
-        <w:shd w:val="clear" w:color="auto" w:fill="F2F2F2"/>
-      </w:pPr>
-      <w:r>
-        <w:rPr>
-          <w:rFonts w:ascii="Consolas" w:eastAsia="Consolas" w:hAnsi="Consolas" w:cs="Consolas"/>
-          <w:sz w:val="19"/>
-          <w:szCs w:val="19"/>
-        </w:rPr>
-        <w:t xml:space="preserve">    console.log(pos+' '+item2(pos))</w:t>
-      </w:r>
-    </w:p>
-    <w:p>
-      <w:pPr>
-        <w:shd w:val="clear" w:color="auto" w:fill="F2F2F2"/>
-      </w:pPr>
-      <w:r>
-        <w:rPr>
-          <w:rFonts w:ascii="Consolas" w:eastAsia="Consolas" w:hAnsi="Consolas" w:cs="Consolas"/>
-          <w:sz w:val="19"/>
-          <w:szCs w:val="19"/>
-        </w:rPr>
-        <w:t>}</w:t>
+        <w:keepLines/>
+        <w:spacing w:after="86"/>
+        <w:jc w:val="center"/>
+      </w:pPr>
+      <w:r>
+        <w:drawing>
+          <wp:inline xmlns:a="http://schemas.openxmlformats.org/drawingml/2006/main" xmlns:pic="http://schemas.openxmlformats.org/drawingml/2006/picture">
+            <wp:extent cx="5227319" cy="3733799"/>
+            <wp:docPr id="2" name="Picture 2"/>
+            <wp:cNvGraphicFramePr>
+              <a:graphicFrameLocks noChangeAspect="1"/>
+            </wp:cNvGraphicFramePr>
+            <a:graphic>
+              <a:graphicData uri="http://schemas.openxmlformats.org/drawingml/2006/picture">
+                <pic:pic>
+                  <pic:nvPicPr>
+                    <pic:cNvPr id="0" name="c1_0.png"/>
+                    <pic:cNvPicPr/>
+                  </pic:nvPicPr>
+                  <pic:blipFill>
+                    <a:blip r:embed="rId8"/>
+                    <a:stretch>
+                      <a:fillRect/>
+                    </a:stretch>
+                  </pic:blipFill>
+                  <pic:spPr>
+                    <a:xfrm>
+                      <a:off x="0" y="0"/>
+                      <a:ext cx="5227319" cy="3733799"/>
+                    </a:xfrm>
+                    <a:prstGeom prst="rect"/>
+                  </pic:spPr>
+                </pic:pic>
+              </a:graphicData>
+            </a:graphic>
+          </wp:inline>
+        </w:drawing>
       </w:r>
     </w:p>
     <w:p>
@@ -2992,197 +2709,43 @@
     </w:p>
     <w:p>
       <w:pPr>
-        <w:shd w:val="clear" w:color="auto" w:fill="F2F2F2"/>
-      </w:pPr>
-      <w:r>
-        <w:rPr>
-          <w:rFonts w:ascii="Consolas" w:eastAsia="Consolas" w:hAnsi="Consolas" w:cs="Consolas"/>
-          <w:sz w:val="19"/>
-          <w:szCs w:val="19"/>
-        </w:rPr>
-        <w:t>function item3(a){</w:t>
-      </w:r>
-    </w:p>
-    <w:p>
-      <w:pPr>
-        <w:shd w:val="clear" w:color="auto" w:fill="F2F2F2"/>
-      </w:pPr>
-      <w:r>
-        <w:rPr>
-          <w:rFonts w:ascii="Consolas" w:eastAsia="Consolas" w:hAnsi="Consolas" w:cs="Consolas"/>
-          <w:sz w:val="19"/>
-          <w:szCs w:val="19"/>
-        </w:rPr>
-        <w:t xml:space="preserve">    let cont=0;</w:t>
-      </w:r>
-    </w:p>
-    <w:p>
-      <w:pPr>
-        <w:shd w:val="clear" w:color="auto" w:fill="F2F2F2"/>
-      </w:pPr>
-      <w:r>
-        <w:rPr>
-          <w:rFonts w:ascii="Consolas" w:eastAsia="Consolas" w:hAnsi="Consolas" w:cs="Consolas"/>
-          <w:sz w:val="19"/>
-          <w:szCs w:val="19"/>
-        </w:rPr>
-        <w:t xml:space="preserve">    let suma = 0;</w:t>
-      </w:r>
-    </w:p>
-    <w:p>
-      <w:pPr>
-        <w:shd w:val="clear" w:color="auto" w:fill="F2F2F2"/>
-      </w:pPr>
-      <w:r>
-        <w:rPr>
-          <w:rFonts w:ascii="Consolas" w:eastAsia="Consolas" w:hAnsi="Consolas" w:cs="Consolas"/>
-          <w:sz w:val="19"/>
-          <w:szCs w:val="19"/>
-        </w:rPr>
-        <w:t xml:space="preserve">    for (let i=2; i&lt;a.length-2; i++){</w:t>
-      </w:r>
-    </w:p>
-    <w:p>
-      <w:pPr>
-        <w:shd w:val="clear" w:color="auto" w:fill="F2F2F2"/>
-      </w:pPr>
-      <w:r>
-        <w:rPr>
-          <w:rFonts w:ascii="Consolas" w:eastAsia="Consolas" w:hAnsi="Consolas" w:cs="Consolas"/>
-          <w:sz w:val="19"/>
-          <w:szCs w:val="19"/>
-        </w:rPr>
-        <w:t xml:space="preserve">        for(let j=0; j&lt;=a.length/2; j++){</w:t>
-      </w:r>
-    </w:p>
-    <w:p>
-      <w:pPr>
-        <w:shd w:val="clear" w:color="auto" w:fill="F2F2F2"/>
-      </w:pPr>
-      <w:r>
-        <w:rPr>
-          <w:rFonts w:ascii="Consolas" w:eastAsia="Consolas" w:hAnsi="Consolas" w:cs="Consolas"/>
-          <w:sz w:val="19"/>
-          <w:szCs w:val="19"/>
-        </w:rPr>
-        <w:t xml:space="preserve">            if (a[j]%2==0){</w:t>
-      </w:r>
-    </w:p>
-    <w:p>
-      <w:pPr>
-        <w:shd w:val="clear" w:color="auto" w:fill="F2F2F2"/>
-      </w:pPr>
-      <w:r>
-        <w:rPr>
-          <w:rFonts w:ascii="Consolas" w:eastAsia="Consolas" w:hAnsi="Consolas" w:cs="Consolas"/>
-          <w:sz w:val="19"/>
-          <w:szCs w:val="19"/>
-        </w:rPr>
-        <w:t xml:space="preserve">                cont++;</w:t>
-      </w:r>
-    </w:p>
-    <w:p>
-      <w:pPr>
-        <w:shd w:val="clear" w:color="auto" w:fill="F2F2F2"/>
-      </w:pPr>
-      <w:r>
-        <w:rPr>
-          <w:rFonts w:ascii="Consolas" w:eastAsia="Consolas" w:hAnsi="Consolas" w:cs="Consolas"/>
-          <w:sz w:val="19"/>
-          <w:szCs w:val="19"/>
-        </w:rPr>
-        <w:t xml:space="preserve">            }else{</w:t>
-      </w:r>
-    </w:p>
-    <w:p>
-      <w:pPr>
-        <w:shd w:val="clear" w:color="auto" w:fill="F2F2F2"/>
-      </w:pPr>
-      <w:r>
-        <w:rPr>
-          <w:rFonts w:ascii="Consolas" w:eastAsia="Consolas" w:hAnsi="Consolas" w:cs="Consolas"/>
-          <w:sz w:val="19"/>
-          <w:szCs w:val="19"/>
-        </w:rPr>
-        <w:t xml:space="preserve">                suma += a[j];</w:t>
-      </w:r>
-    </w:p>
-    <w:p>
-      <w:pPr>
-        <w:shd w:val="clear" w:color="auto" w:fill="F2F2F2"/>
-      </w:pPr>
-      <w:r>
-        <w:rPr>
-          <w:rFonts w:ascii="Consolas" w:eastAsia="Consolas" w:hAnsi="Consolas" w:cs="Consolas"/>
-          <w:sz w:val="19"/>
-          <w:szCs w:val="19"/>
-        </w:rPr>
-        <w:t xml:space="preserve">                a[j]+=2;</w:t>
-      </w:r>
-    </w:p>
-    <w:p>
-      <w:pPr>
-        <w:shd w:val="clear" w:color="auto" w:fill="F2F2F2"/>
-      </w:pPr>
-      <w:r>
-        <w:rPr>
-          <w:rFonts w:ascii="Consolas" w:eastAsia="Consolas" w:hAnsi="Consolas" w:cs="Consolas"/>
-          <w:sz w:val="19"/>
-          <w:szCs w:val="19"/>
-        </w:rPr>
-        <w:t xml:space="preserve">            }</w:t>
-      </w:r>
-    </w:p>
-    <w:p>
-      <w:pPr>
-        <w:shd w:val="clear" w:color="auto" w:fill="F2F2F2"/>
-      </w:pPr>
-      <w:r>
-        <w:rPr>
-          <w:rFonts w:ascii="Consolas" w:eastAsia="Consolas" w:hAnsi="Consolas" w:cs="Consolas"/>
-          <w:sz w:val="19"/>
-          <w:szCs w:val="19"/>
-        </w:rPr>
-        <w:t xml:space="preserve">        }</w:t>
-      </w:r>
-    </w:p>
-    <w:p>
-      <w:pPr>
-        <w:shd w:val="clear" w:color="auto" w:fill="F2F2F2"/>
-      </w:pPr>
-      <w:r>
-        <w:rPr>
-          <w:rFonts w:ascii="Consolas" w:eastAsia="Consolas" w:hAnsi="Consolas" w:cs="Consolas"/>
-          <w:sz w:val="19"/>
-          <w:szCs w:val="19"/>
-        </w:rPr>
-        <w:t xml:space="preserve">    }</w:t>
-      </w:r>
-    </w:p>
-    <w:p>
-      <w:pPr>
-        <w:shd w:val="clear" w:color="auto" w:fill="F2F2F2"/>
-      </w:pPr>
-      <w:r>
-        <w:rPr>
-          <w:rFonts w:ascii="Consolas" w:eastAsia="Consolas" w:hAnsi="Consolas" w:cs="Consolas"/>
-          <w:sz w:val="19"/>
-          <w:szCs w:val="19"/>
-        </w:rPr>
-        <w:t xml:space="preserve">    return cont;</w:t>
-      </w:r>
-    </w:p>
-    <w:p>
-      <w:pPr>
-        <w:shd w:val="clear" w:color="auto" w:fill="F2F2F2"/>
-      </w:pPr>
-      <w:r>
-        <w:rPr>
-          <w:rFonts w:ascii="Consolas" w:eastAsia="Consolas" w:hAnsi="Consolas" w:cs="Consolas"/>
-          <w:sz w:val="19"/>
-          <w:szCs w:val="19"/>
-        </w:rPr>
-        <w:t>}</w:t>
+        <w:keepLines/>
+        <w:spacing w:after="86"/>
+        <w:jc w:val="center"/>
+      </w:pPr>
+      <w:r>
+        <w:drawing>
+          <wp:inline xmlns:a="http://schemas.openxmlformats.org/drawingml/2006/main" xmlns:pic="http://schemas.openxmlformats.org/drawingml/2006/picture">
+            <wp:extent cx="5227319" cy="3537775"/>
+            <wp:docPr id="3" name="Picture 3"/>
+            <wp:cNvGraphicFramePr>
+              <a:graphicFrameLocks noChangeAspect="1"/>
+            </wp:cNvGraphicFramePr>
+            <a:graphic>
+              <a:graphicData uri="http://schemas.openxmlformats.org/drawingml/2006/picture">
+                <pic:pic>
+                  <pic:nvPicPr>
+                    <pic:cNvPr id="0" name="c2_0.png"/>
+                    <pic:cNvPicPr/>
+                  </pic:nvPicPr>
+                  <pic:blipFill>
+                    <a:blip r:embed="rId9"/>
+                    <a:stretch>
+                      <a:fillRect/>
+                    </a:stretch>
+                  </pic:blipFill>
+                  <pic:spPr>
+                    <a:xfrm>
+                      <a:off x="0" y="0"/>
+                      <a:ext cx="5227319" cy="3537775"/>
+                    </a:xfrm>
+                    <a:prstGeom prst="rect"/>
+                  </pic:spPr>
+                </pic:pic>
+              </a:graphicData>
+            </a:graphic>
+          </wp:inline>
+        </w:drawing>
       </w:r>
     </w:p>
     <w:p>
@@ -3275,315 +2838,43 @@
     </w:p>
     <w:p>
       <w:pPr>
-        <w:shd w:val="clear" w:color="auto" w:fill="F2F2F2"/>
-      </w:pPr>
-      <w:r>
-        <w:rPr>
-          <w:rFonts w:ascii="Consolas" w:eastAsia="Consolas" w:hAnsi="Consolas" w:cs="Consolas"/>
-          <w:sz w:val="19"/>
-          <w:szCs w:val="19"/>
-        </w:rPr>
-        <w:t>function item4(a){</w:t>
-      </w:r>
-    </w:p>
-    <w:p>
-      <w:pPr>
-        <w:shd w:val="clear" w:color="auto" w:fill="F2F2F2"/>
-      </w:pPr>
-      <w:r>
-        <w:rPr>
-          <w:rFonts w:ascii="Consolas" w:eastAsia="Consolas" w:hAnsi="Consolas" w:cs="Consolas"/>
-          <w:sz w:val="19"/>
-          <w:szCs w:val="19"/>
-        </w:rPr>
-        <w:t xml:space="preserve">    let veces=0;</w:t>
-      </w:r>
-    </w:p>
-    <w:p>
-      <w:pPr>
-        <w:shd w:val="clear" w:color="auto" w:fill="F2F2F2"/>
-      </w:pPr>
-      <w:r>
-        <w:rPr>
-          <w:rFonts w:ascii="Consolas" w:eastAsia="Consolas" w:hAnsi="Consolas" w:cs="Consolas"/>
-          <w:sz w:val="19"/>
-          <w:szCs w:val="19"/>
-        </w:rPr>
-        <w:t xml:space="preserve"> </w:t>
-      </w:r>
-    </w:p>
-    <w:p>
-      <w:pPr>
-        <w:shd w:val="clear" w:color="auto" w:fill="F2F2F2"/>
-      </w:pPr>
-      <w:r>
-        <w:rPr>
-          <w:rFonts w:ascii="Consolas" w:eastAsia="Consolas" w:hAnsi="Consolas" w:cs="Consolas"/>
-          <w:sz w:val="19"/>
-          <w:szCs w:val="19"/>
-        </w:rPr>
-        <w:t xml:space="preserve">    for (let i=0; i&lt;a.length; i++){</w:t>
-      </w:r>
-    </w:p>
-    <w:p>
-      <w:pPr>
-        <w:shd w:val="clear" w:color="auto" w:fill="F2F2F2"/>
-      </w:pPr>
-      <w:r>
-        <w:rPr>
-          <w:rFonts w:ascii="Consolas" w:eastAsia="Consolas" w:hAnsi="Consolas" w:cs="Consolas"/>
-          <w:sz w:val="19"/>
-          <w:szCs w:val="19"/>
-        </w:rPr>
-        <w:t xml:space="preserve">        a[i] += item5(a,i);</w:t>
-      </w:r>
-    </w:p>
-    <w:p>
-      <w:pPr>
-        <w:shd w:val="clear" w:color="auto" w:fill="F2F2F2"/>
-      </w:pPr>
-      <w:r>
-        <w:rPr>
-          <w:rFonts w:ascii="Consolas" w:eastAsia="Consolas" w:hAnsi="Consolas" w:cs="Consolas"/>
-          <w:sz w:val="19"/>
-          <w:szCs w:val="19"/>
-        </w:rPr>
-        <w:t xml:space="preserve">        if (a[i]&gt;2){</w:t>
-      </w:r>
-    </w:p>
-    <w:p>
-      <w:pPr>
-        <w:shd w:val="clear" w:color="auto" w:fill="F2F2F2"/>
-      </w:pPr>
-      <w:r>
-        <w:rPr>
-          <w:rFonts w:ascii="Consolas" w:eastAsia="Consolas" w:hAnsi="Consolas" w:cs="Consolas"/>
-          <w:sz w:val="19"/>
-          <w:szCs w:val="19"/>
-        </w:rPr>
-        <w:t xml:space="preserve">            veces++;</w:t>
-      </w:r>
-    </w:p>
-    <w:p>
-      <w:pPr>
-        <w:shd w:val="clear" w:color="auto" w:fill="F2F2F2"/>
-      </w:pPr>
-      <w:r>
-        <w:rPr>
-          <w:rFonts w:ascii="Consolas" w:eastAsia="Consolas" w:hAnsi="Consolas" w:cs="Consolas"/>
-          <w:sz w:val="19"/>
-          <w:szCs w:val="19"/>
-        </w:rPr>
-        <w:t xml:space="preserve">        }</w:t>
-      </w:r>
-    </w:p>
-    <w:p>
-      <w:pPr>
-        <w:shd w:val="clear" w:color="auto" w:fill="F2F2F2"/>
-      </w:pPr>
-      <w:r>
-        <w:rPr>
-          <w:rFonts w:ascii="Consolas" w:eastAsia="Consolas" w:hAnsi="Consolas" w:cs="Consolas"/>
-          <w:sz w:val="19"/>
-          <w:szCs w:val="19"/>
-        </w:rPr>
-        <w:t xml:space="preserve">    }</w:t>
-      </w:r>
-    </w:p>
-    <w:p>
-      <w:pPr>
-        <w:shd w:val="clear" w:color="auto" w:fill="F2F2F2"/>
-      </w:pPr>
-      <w:r>
-        <w:rPr>
-          <w:rFonts w:ascii="Consolas" w:eastAsia="Consolas" w:hAnsi="Consolas" w:cs="Consolas"/>
-          <w:sz w:val="19"/>
-          <w:szCs w:val="19"/>
-        </w:rPr>
-        <w:t xml:space="preserve">    return veces;</w:t>
-      </w:r>
-    </w:p>
-    <w:p>
-      <w:pPr>
-        <w:shd w:val="clear" w:color="auto" w:fill="F2F2F2"/>
-      </w:pPr>
-      <w:r>
-        <w:rPr>
-          <w:rFonts w:ascii="Consolas" w:eastAsia="Consolas" w:hAnsi="Consolas" w:cs="Consolas"/>
-          <w:sz w:val="19"/>
-          <w:szCs w:val="19"/>
-        </w:rPr>
-        <w:t>}</w:t>
-      </w:r>
-    </w:p>
-    <w:p>
-      <w:pPr>
-        <w:shd w:val="clear" w:color="auto" w:fill="F2F2F2"/>
-      </w:pPr>
-      <w:r>
-        <w:rPr>
-          <w:rFonts w:ascii="Consolas" w:eastAsia="Consolas" w:hAnsi="Consolas" w:cs="Consolas"/>
-          <w:sz w:val="19"/>
-          <w:szCs w:val="19"/>
-        </w:rPr>
-        <w:lastRenderedPageBreak/>
-        <w:t xml:space="preserve"> </w:t>
-      </w:r>
-    </w:p>
-    <w:p>
-      <w:pPr>
-        <w:shd w:val="clear" w:color="auto" w:fill="F2F2F2"/>
-      </w:pPr>
-      <w:r>
-        <w:rPr>
-          <w:rFonts w:ascii="Consolas" w:eastAsia="Consolas" w:hAnsi="Consolas" w:cs="Consolas"/>
-          <w:sz w:val="19"/>
-          <w:szCs w:val="19"/>
-        </w:rPr>
-        <w:t>function item5(a,b){</w:t>
-      </w:r>
-    </w:p>
-    <w:p>
-      <w:pPr>
-        <w:shd w:val="clear" w:color="auto" w:fill="F2F2F2"/>
-      </w:pPr>
-      <w:r>
-        <w:rPr>
-          <w:rFonts w:ascii="Consolas" w:eastAsia="Consolas" w:hAnsi="Consolas" w:cs="Consolas"/>
-          <w:sz w:val="19"/>
-          <w:szCs w:val="19"/>
-        </w:rPr>
-        <w:t xml:space="preserve">    let cont=0;</w:t>
-      </w:r>
-    </w:p>
-    <w:p>
-      <w:pPr>
-        <w:shd w:val="clear" w:color="auto" w:fill="F2F2F2"/>
-      </w:pPr>
-      <w:r>
-        <w:rPr>
-          <w:rFonts w:ascii="Consolas" w:eastAsia="Consolas" w:hAnsi="Consolas" w:cs="Consolas"/>
-          <w:sz w:val="19"/>
-          <w:szCs w:val="19"/>
-        </w:rPr>
-        <w:t xml:space="preserve"> </w:t>
-      </w:r>
-    </w:p>
-    <w:p>
-      <w:pPr>
-        <w:shd w:val="clear" w:color="auto" w:fill="F2F2F2"/>
-      </w:pPr>
-      <w:r>
-        <w:rPr>
-          <w:rFonts w:ascii="Consolas" w:eastAsia="Consolas" w:hAnsi="Consolas" w:cs="Consolas"/>
-          <w:sz w:val="19"/>
-          <w:szCs w:val="19"/>
-        </w:rPr>
-        <w:t xml:space="preserve">    for (let i=0; i&lt;a.length; i++){</w:t>
-      </w:r>
-    </w:p>
-    <w:p>
-      <w:pPr>
-        <w:shd w:val="clear" w:color="auto" w:fill="F2F2F2"/>
-      </w:pPr>
-      <w:r>
-        <w:rPr>
-          <w:rFonts w:ascii="Consolas" w:eastAsia="Consolas" w:hAnsi="Consolas" w:cs="Consolas"/>
-          <w:sz w:val="19"/>
-          <w:szCs w:val="19"/>
-        </w:rPr>
-        <w:t xml:space="preserve">        if (i!=b){</w:t>
-      </w:r>
-    </w:p>
-    <w:p>
-      <w:pPr>
-        <w:shd w:val="clear" w:color="auto" w:fill="F2F2F2"/>
-      </w:pPr>
-      <w:r>
-        <w:rPr>
-          <w:rFonts w:ascii="Consolas" w:eastAsia="Consolas" w:hAnsi="Consolas" w:cs="Consolas"/>
-          <w:sz w:val="19"/>
-          <w:szCs w:val="19"/>
-        </w:rPr>
-        <w:t xml:space="preserve">            if (a[i]&gt;a[b]){</w:t>
-      </w:r>
-    </w:p>
-    <w:p>
-      <w:pPr>
-        <w:shd w:val="clear" w:color="auto" w:fill="F2F2F2"/>
-      </w:pPr>
-      <w:r>
-        <w:rPr>
-          <w:rFonts w:ascii="Consolas" w:eastAsia="Consolas" w:hAnsi="Consolas" w:cs="Consolas"/>
-          <w:sz w:val="19"/>
-          <w:szCs w:val="19"/>
-        </w:rPr>
-        <w:t xml:space="preserve">                cont++;</w:t>
-      </w:r>
-    </w:p>
-    <w:p>
-      <w:pPr>
-        <w:shd w:val="clear" w:color="auto" w:fill="F2F2F2"/>
-      </w:pPr>
-      <w:r>
-        <w:rPr>
-          <w:rFonts w:ascii="Consolas" w:eastAsia="Consolas" w:hAnsi="Consolas" w:cs="Consolas"/>
-          <w:sz w:val="19"/>
-          <w:szCs w:val="19"/>
-        </w:rPr>
-        <w:t xml:space="preserve">            }</w:t>
-      </w:r>
-    </w:p>
-    <w:p>
-      <w:pPr>
-        <w:shd w:val="clear" w:color="auto" w:fill="F2F2F2"/>
-      </w:pPr>
-      <w:r>
-        <w:rPr>
-          <w:rFonts w:ascii="Consolas" w:eastAsia="Consolas" w:hAnsi="Consolas" w:cs="Consolas"/>
-          <w:sz w:val="19"/>
-          <w:szCs w:val="19"/>
-        </w:rPr>
-        <w:t xml:space="preserve">        }</w:t>
-      </w:r>
-    </w:p>
-    <w:p>
-      <w:pPr>
-        <w:shd w:val="clear" w:color="auto" w:fill="F2F2F2"/>
-      </w:pPr>
-      <w:r>
-        <w:rPr>
-          <w:rFonts w:ascii="Consolas" w:eastAsia="Consolas" w:hAnsi="Consolas" w:cs="Consolas"/>
-          <w:sz w:val="19"/>
-          <w:szCs w:val="19"/>
-        </w:rPr>
-        <w:t xml:space="preserve">    }</w:t>
-      </w:r>
-    </w:p>
-    <w:p>
-      <w:pPr>
-        <w:shd w:val="clear" w:color="auto" w:fill="F2F2F2"/>
-      </w:pPr>
-      <w:r>
-        <w:rPr>
-          <w:rFonts w:ascii="Consolas" w:eastAsia="Consolas" w:hAnsi="Consolas" w:cs="Consolas"/>
-          <w:sz w:val="19"/>
-          <w:szCs w:val="19"/>
-        </w:rPr>
-        <w:t xml:space="preserve">    return cont;</w:t>
-      </w:r>
-    </w:p>
-    <w:p>
-      <w:pPr>
-        <w:shd w:val="clear" w:color="auto" w:fill="F2F2F2"/>
-      </w:pPr>
-      <w:r>
-        <w:rPr>
-          <w:rFonts w:ascii="Consolas" w:eastAsia="Consolas" w:hAnsi="Consolas" w:cs="Consolas"/>
-          <w:sz w:val="19"/>
-          <w:szCs w:val="19"/>
-        </w:rPr>
-        <w:t>}</w:t>
+        <w:keepLines/>
+        <w:spacing w:after="86"/>
+        <w:jc w:val="center"/>
+      </w:pPr>
+      <w:r>
+        <w:drawing>
+          <wp:inline xmlns:a="http://schemas.openxmlformats.org/drawingml/2006/main" xmlns:pic="http://schemas.openxmlformats.org/drawingml/2006/picture">
+            <wp:extent cx="5227319" cy="5301995"/>
+            <wp:docPr id="4" name="Picture 4"/>
+            <wp:cNvGraphicFramePr>
+              <a:graphicFrameLocks noChangeAspect="1"/>
+            </wp:cNvGraphicFramePr>
+            <a:graphic>
+              <a:graphicData uri="http://schemas.openxmlformats.org/drawingml/2006/picture">
+                <pic:pic>
+                  <pic:nvPicPr>
+                    <pic:cNvPr id="0" name="c3_0.png"/>
+                    <pic:cNvPicPr/>
+                  </pic:nvPicPr>
+                  <pic:blipFill>
+                    <a:blip r:embed="rId10"/>
+                    <a:stretch>
+                      <a:fillRect/>
+                    </a:stretch>
+                  </pic:blipFill>
+                  <pic:spPr>
+                    <a:xfrm>
+                      <a:off x="0" y="0"/>
+                      <a:ext cx="5227319" cy="5301995"/>
+                    </a:xfrm>
+                    <a:prstGeom prst="rect"/>
+                  </pic:spPr>
+                </pic:pic>
+              </a:graphicData>
+            </a:graphic>
+          </wp:inline>
+        </w:drawing>
       </w:r>
     </w:p>
     <w:p>
@@ -3739,419 +3030,125 @@
     </w:p>
     <w:p>
       <w:pPr>
-        <w:shd w:val="clear" w:color="auto" w:fill="F2F2F2"/>
-      </w:pPr>
-      <w:r>
-        <w:rPr>
-          <w:rFonts w:ascii="Consolas" w:eastAsia="Consolas" w:hAnsi="Consolas" w:cs="Consolas"/>
-          <w:sz w:val="19"/>
-          <w:szCs w:val="19"/>
-        </w:rPr>
-        <w:t>static void bubbleSort(int arr[], int n){</w:t>
-      </w:r>
-    </w:p>
-    <w:p>
-      <w:pPr>
-        <w:shd w:val="clear" w:color="auto" w:fill="F2F2F2"/>
-      </w:pPr>
-      <w:r>
-        <w:rPr>
-          <w:rFonts w:ascii="Consolas" w:eastAsia="Consolas" w:hAnsi="Consolas" w:cs="Consolas"/>
-          <w:sz w:val="19"/>
-          <w:szCs w:val="19"/>
-        </w:rPr>
-        <w:t xml:space="preserve">    int i, j, temp;</w:t>
-      </w:r>
-    </w:p>
-    <w:p>
-      <w:pPr>
-        <w:shd w:val="clear" w:color="auto" w:fill="F2F2F2"/>
-      </w:pPr>
-      <w:r>
-        <w:rPr>
-          <w:rFonts w:ascii="Consolas" w:eastAsia="Consolas" w:hAnsi="Consolas" w:cs="Consolas"/>
-          <w:sz w:val="19"/>
-          <w:szCs w:val="19"/>
-        </w:rPr>
-        <w:t xml:space="preserve">    boolean swapped;</w:t>
-      </w:r>
-    </w:p>
-    <w:p>
-      <w:pPr>
-        <w:shd w:val="clear" w:color="auto" w:fill="F2F2F2"/>
-      </w:pPr>
-      <w:r>
-        <w:rPr>
-          <w:rFonts w:ascii="Consolas" w:eastAsia="Consolas" w:hAnsi="Consolas" w:cs="Consolas"/>
-          <w:sz w:val="19"/>
-          <w:szCs w:val="19"/>
-        </w:rPr>
-        <w:t xml:space="preserve">    for (i = 0; i &lt; n - 1; i++) {</w:t>
-      </w:r>
-    </w:p>
-    <w:p>
-      <w:pPr>
-        <w:shd w:val="clear" w:color="auto" w:fill="F2F2F2"/>
-      </w:pPr>
-      <w:r>
-        <w:rPr>
-          <w:rFonts w:ascii="Consolas" w:eastAsia="Consolas" w:hAnsi="Consolas" w:cs="Consolas"/>
-          <w:sz w:val="19"/>
-          <w:szCs w:val="19"/>
-        </w:rPr>
-        <w:t xml:space="preserve">        swapped = false;</w:t>
-      </w:r>
-    </w:p>
-    <w:p>
-      <w:pPr>
-        <w:shd w:val="clear" w:color="auto" w:fill="F2F2F2"/>
-      </w:pPr>
-      <w:r>
-        <w:rPr>
-          <w:rFonts w:ascii="Consolas" w:eastAsia="Consolas" w:hAnsi="Consolas" w:cs="Consolas"/>
-          <w:sz w:val="19"/>
-          <w:szCs w:val="19"/>
-        </w:rPr>
-        <w:t xml:space="preserve">        for (j = 0; j &lt; n - i - 1; j++) {</w:t>
-      </w:r>
-    </w:p>
-    <w:p>
-      <w:pPr>
-        <w:shd w:val="clear" w:color="auto" w:fill="F2F2F2"/>
-      </w:pPr>
-      <w:r>
-        <w:rPr>
-          <w:rFonts w:ascii="Consolas" w:eastAsia="Consolas" w:hAnsi="Consolas" w:cs="Consolas"/>
-          <w:sz w:val="19"/>
-          <w:szCs w:val="19"/>
-        </w:rPr>
-        <w:lastRenderedPageBreak/>
-        <w:t xml:space="preserve">            if (arr[j] &gt; arr[j + 1]) {</w:t>
-      </w:r>
-    </w:p>
-    <w:p>
-      <w:pPr>
-        <w:shd w:val="clear" w:color="auto" w:fill="F2F2F2"/>
-      </w:pPr>
-      <w:r>
-        <w:rPr>
-          <w:rFonts w:ascii="Consolas" w:eastAsia="Consolas" w:hAnsi="Consolas" w:cs="Consolas"/>
-          <w:sz w:val="19"/>
-          <w:szCs w:val="19"/>
-        </w:rPr>
-        <w:t xml:space="preserve">                temp = arr[j];</w:t>
-      </w:r>
-    </w:p>
-    <w:p>
-      <w:pPr>
-        <w:shd w:val="clear" w:color="auto" w:fill="F2F2F2"/>
-      </w:pPr>
-      <w:r>
-        <w:rPr>
-          <w:rFonts w:ascii="Consolas" w:eastAsia="Consolas" w:hAnsi="Consolas" w:cs="Consolas"/>
-          <w:sz w:val="19"/>
-          <w:szCs w:val="19"/>
-        </w:rPr>
-        <w:t xml:space="preserve">                arr[j] = arr[j + 1];</w:t>
-      </w:r>
-    </w:p>
-    <w:p>
-      <w:pPr>
-        <w:shd w:val="clear" w:color="auto" w:fill="F2F2F2"/>
-      </w:pPr>
-      <w:r>
-        <w:rPr>
-          <w:rFonts w:ascii="Consolas" w:eastAsia="Consolas" w:hAnsi="Consolas" w:cs="Consolas"/>
-          <w:sz w:val="19"/>
-          <w:szCs w:val="19"/>
-        </w:rPr>
-        <w:t xml:space="preserve">                arr[j + 1] = temp;</w:t>
-      </w:r>
-    </w:p>
-    <w:p>
-      <w:pPr>
-        <w:shd w:val="clear" w:color="auto" w:fill="F2F2F2"/>
-      </w:pPr>
-      <w:r>
-        <w:rPr>
-          <w:rFonts w:ascii="Consolas" w:eastAsia="Consolas" w:hAnsi="Consolas" w:cs="Consolas"/>
-          <w:sz w:val="19"/>
-          <w:szCs w:val="19"/>
-        </w:rPr>
-        <w:t xml:space="preserve">                swapped = true;</w:t>
-      </w:r>
-    </w:p>
-    <w:p>
-      <w:pPr>
-        <w:shd w:val="clear" w:color="auto" w:fill="F2F2F2"/>
-      </w:pPr>
-      <w:r>
-        <w:rPr>
-          <w:rFonts w:ascii="Consolas" w:eastAsia="Consolas" w:hAnsi="Consolas" w:cs="Consolas"/>
-          <w:sz w:val="19"/>
-          <w:szCs w:val="19"/>
-        </w:rPr>
-        <w:t xml:space="preserve">            }</w:t>
-      </w:r>
-    </w:p>
-    <w:p>
-      <w:pPr>
-        <w:shd w:val="clear" w:color="auto" w:fill="F2F2F2"/>
-      </w:pPr>
-      <w:r>
-        <w:rPr>
-          <w:rFonts w:ascii="Consolas" w:eastAsia="Consolas" w:hAnsi="Consolas" w:cs="Consolas"/>
-          <w:sz w:val="19"/>
-          <w:szCs w:val="19"/>
-        </w:rPr>
-        <w:t xml:space="preserve">        }</w:t>
-      </w:r>
-    </w:p>
-    <w:p>
-      <w:pPr>
-        <w:shd w:val="clear" w:color="auto" w:fill="F2F2F2"/>
-      </w:pPr>
-      <w:r>
-        <w:rPr>
-          <w:rFonts w:ascii="Consolas" w:eastAsia="Consolas" w:hAnsi="Consolas" w:cs="Consolas"/>
-          <w:sz w:val="19"/>
-          <w:szCs w:val="19"/>
-        </w:rPr>
-        <w:t xml:space="preserve">        if (swapped == false)</w:t>
-      </w:r>
-    </w:p>
-    <w:p>
-      <w:pPr>
-        <w:shd w:val="clear" w:color="auto" w:fill="F2F2F2"/>
-      </w:pPr>
-      <w:r>
-        <w:rPr>
-          <w:rFonts w:ascii="Consolas" w:eastAsia="Consolas" w:hAnsi="Consolas" w:cs="Consolas"/>
-          <w:sz w:val="19"/>
-          <w:szCs w:val="19"/>
-        </w:rPr>
-        <w:t xml:space="preserve">            break;</w:t>
-      </w:r>
-    </w:p>
-    <w:p>
-      <w:pPr>
-        <w:shd w:val="clear" w:color="auto" w:fill="F2F2F2"/>
-      </w:pPr>
-      <w:r>
-        <w:rPr>
-          <w:rFonts w:ascii="Consolas" w:eastAsia="Consolas" w:hAnsi="Consolas" w:cs="Consolas"/>
-          <w:sz w:val="19"/>
-          <w:szCs w:val="19"/>
-        </w:rPr>
-        <w:t xml:space="preserve">    }</w:t>
-      </w:r>
-    </w:p>
-    <w:p>
-      <w:pPr>
-        <w:shd w:val="clear" w:color="auto" w:fill="F2F2F2"/>
-      </w:pPr>
-      <w:r>
-        <w:rPr>
-          <w:rFonts w:ascii="Consolas" w:eastAsia="Consolas" w:hAnsi="Consolas" w:cs="Consolas"/>
-          <w:sz w:val="19"/>
-          <w:szCs w:val="19"/>
-        </w:rPr>
-        <w:t>}</w:t>
-      </w:r>
-    </w:p>
-    <w:p>
-      <w:pPr>
-        <w:shd w:val="clear" w:color="auto" w:fill="F2F2F2"/>
-      </w:pPr>
-      <w:r>
-        <w:rPr>
-          <w:rFonts w:ascii="Consolas" w:eastAsia="Consolas" w:hAnsi="Consolas" w:cs="Consolas"/>
-          <w:sz w:val="19"/>
-          <w:szCs w:val="19"/>
-        </w:rPr>
-        <w:t xml:space="preserve"> </w:t>
-      </w:r>
-    </w:p>
-    <w:p>
-      <w:pPr>
-        <w:shd w:val="clear" w:color="auto" w:fill="F2F2F2"/>
-      </w:pPr>
-      <w:r>
-        <w:rPr>
-          <w:rFonts w:ascii="Consolas" w:eastAsia="Consolas" w:hAnsi="Consolas" w:cs="Consolas"/>
-          <w:sz w:val="19"/>
-          <w:szCs w:val="19"/>
-        </w:rPr>
-        <w:t>static void printArray(int arr[], int size){</w:t>
-      </w:r>
-    </w:p>
-    <w:p>
-      <w:pPr>
-        <w:shd w:val="clear" w:color="auto" w:fill="F2F2F2"/>
-      </w:pPr>
-      <w:r>
-        <w:rPr>
-          <w:rFonts w:ascii="Consolas" w:eastAsia="Consolas" w:hAnsi="Consolas" w:cs="Consolas"/>
-          <w:sz w:val="19"/>
-          <w:szCs w:val="19"/>
-        </w:rPr>
-        <w:t xml:space="preserve">    int i;</w:t>
-      </w:r>
-    </w:p>
-    <w:p>
-      <w:pPr>
-        <w:shd w:val="clear" w:color="auto" w:fill="F2F2F2"/>
-      </w:pPr>
-      <w:r>
-        <w:rPr>
-          <w:rFonts w:ascii="Consolas" w:eastAsia="Consolas" w:hAnsi="Consolas" w:cs="Consolas"/>
-          <w:sz w:val="19"/>
-          <w:szCs w:val="19"/>
-        </w:rPr>
-        <w:t xml:space="preserve">    for (i = 0; i &lt; size; i++)</w:t>
-      </w:r>
-    </w:p>
-    <w:p>
-      <w:pPr>
-        <w:shd w:val="clear" w:color="auto" w:fill="F2F2F2"/>
-      </w:pPr>
-      <w:r>
-        <w:rPr>
-          <w:rFonts w:ascii="Consolas" w:eastAsia="Consolas" w:hAnsi="Consolas" w:cs="Consolas"/>
-          <w:sz w:val="19"/>
-          <w:szCs w:val="19"/>
-        </w:rPr>
-        <w:t xml:space="preserve">        System.out.print(arr[i] + " ");</w:t>
-      </w:r>
-    </w:p>
-    <w:p>
-      <w:pPr>
-        <w:shd w:val="clear" w:color="auto" w:fill="F2F2F2"/>
-      </w:pPr>
-      <w:r>
-        <w:rPr>
-          <w:rFonts w:ascii="Consolas" w:eastAsia="Consolas" w:hAnsi="Consolas" w:cs="Consolas"/>
-          <w:sz w:val="19"/>
-          <w:szCs w:val="19"/>
-        </w:rPr>
-        <w:t xml:space="preserve">    System.out.println();</w:t>
-      </w:r>
-    </w:p>
-    <w:p>
-      <w:pPr>
-        <w:shd w:val="clear" w:color="auto" w:fill="F2F2F2"/>
-      </w:pPr>
-      <w:r>
-        <w:rPr>
-          <w:rFonts w:ascii="Consolas" w:eastAsia="Consolas" w:hAnsi="Consolas" w:cs="Consolas"/>
-          <w:sz w:val="19"/>
-          <w:szCs w:val="19"/>
-        </w:rPr>
-        <w:t>}</w:t>
-      </w:r>
-    </w:p>
-    <w:p>
-      <w:pPr>
-        <w:shd w:val="clear" w:color="auto" w:fill="F2F2F2"/>
-      </w:pPr>
-      <w:r>
-        <w:rPr>
-          <w:rFonts w:ascii="Consolas" w:eastAsia="Consolas" w:hAnsi="Consolas" w:cs="Consolas"/>
-          <w:sz w:val="19"/>
-          <w:szCs w:val="19"/>
-        </w:rPr>
-        <w:t xml:space="preserve"> </w:t>
-      </w:r>
-    </w:p>
-    <w:p>
-      <w:pPr>
-        <w:shd w:val="clear" w:color="auto" w:fill="F2F2F2"/>
-      </w:pPr>
-      <w:r>
-        <w:rPr>
-          <w:rFonts w:ascii="Consolas" w:eastAsia="Consolas" w:hAnsi="Consolas" w:cs="Consolas"/>
-          <w:sz w:val="19"/>
-          <w:szCs w:val="19"/>
-        </w:rPr>
-        <w:t>public static void main(String args[]){</w:t>
-      </w:r>
-    </w:p>
-    <w:p>
-      <w:pPr>
-        <w:shd w:val="clear" w:color="auto" w:fill="F2F2F2"/>
-      </w:pPr>
-      <w:r>
-        <w:rPr>
-          <w:rFonts w:ascii="Consolas" w:eastAsia="Consolas" w:hAnsi="Consolas" w:cs="Consolas"/>
-          <w:sz w:val="19"/>
-          <w:szCs w:val="19"/>
-        </w:rPr>
-        <w:t xml:space="preserve">    int arr[] = { 64, 34, 25, 12, 22, 11, 90 };</w:t>
-      </w:r>
-    </w:p>
-    <w:p>
-      <w:pPr>
-        <w:shd w:val="clear" w:color="auto" w:fill="F2F2F2"/>
-      </w:pPr>
-      <w:r>
-        <w:rPr>
-          <w:rFonts w:ascii="Consolas" w:eastAsia="Consolas" w:hAnsi="Consolas" w:cs="Consolas"/>
-          <w:sz w:val="19"/>
-          <w:szCs w:val="19"/>
-        </w:rPr>
-        <w:t xml:space="preserve">    int n = arr.length;</w:t>
-      </w:r>
-    </w:p>
-    <w:p>
-      <w:pPr>
-        <w:shd w:val="clear" w:color="auto" w:fill="F2F2F2"/>
-      </w:pPr>
-      <w:r>
-        <w:rPr>
-          <w:rFonts w:ascii="Consolas" w:eastAsia="Consolas" w:hAnsi="Consolas" w:cs="Consolas"/>
-          <w:sz w:val="19"/>
-          <w:szCs w:val="19"/>
-        </w:rPr>
-        <w:t xml:space="preserve">    bubbleSort(arr, n);</w:t>
-      </w:r>
-    </w:p>
-    <w:p>
-      <w:pPr>
-        <w:shd w:val="clear" w:color="auto" w:fill="F2F2F2"/>
-      </w:pPr>
-      <w:r>
-        <w:rPr>
-          <w:rFonts w:ascii="Consolas" w:eastAsia="Consolas" w:hAnsi="Consolas" w:cs="Consolas"/>
-          <w:sz w:val="19"/>
-          <w:szCs w:val="19"/>
-        </w:rPr>
-        <w:t xml:space="preserve">    System.out.println("Sorted array: ");</w:t>
-      </w:r>
-    </w:p>
-    <w:p>
-      <w:pPr>
-        <w:shd w:val="clear" w:color="auto" w:fill="F2F2F2"/>
-      </w:pPr>
-      <w:r>
-        <w:rPr>
-          <w:rFonts w:ascii="Consolas" w:eastAsia="Consolas" w:hAnsi="Consolas" w:cs="Consolas"/>
-          <w:sz w:val="19"/>
-          <w:szCs w:val="19"/>
-        </w:rPr>
-        <w:t xml:space="preserve">    printArray(arr, n);</w:t>
-      </w:r>
-    </w:p>
-    <w:p>
-      <w:pPr>
-        <w:shd w:val="clear" w:color="auto" w:fill="F2F2F2"/>
-      </w:pPr>
-      <w:r>
-        <w:rPr>
-          <w:rFonts w:ascii="Consolas" w:eastAsia="Consolas" w:hAnsi="Consolas" w:cs="Consolas"/>
-          <w:sz w:val="19"/>
-          <w:szCs w:val="19"/>
-        </w:rPr>
-        <w:t>}</w:t>
+        <w:keepLines/>
+        <w:spacing w:after="86"/>
+        <w:jc w:val="center"/>
+      </w:pPr>
+      <w:r>
+        <w:drawing>
+          <wp:inline xmlns:a="http://schemas.openxmlformats.org/drawingml/2006/main" xmlns:pic="http://schemas.openxmlformats.org/drawingml/2006/picture">
+            <wp:extent cx="5227319" cy="3929824"/>
+            <wp:docPr id="5" name="Picture 5"/>
+            <wp:cNvGraphicFramePr>
+              <a:graphicFrameLocks noChangeAspect="1"/>
+            </wp:cNvGraphicFramePr>
+            <a:graphic>
+              <a:graphicData uri="http://schemas.openxmlformats.org/drawingml/2006/picture">
+                <pic:pic>
+                  <pic:nvPicPr>
+                    <pic:cNvPr id="0" name="c4_0.png"/>
+                    <pic:cNvPicPr/>
+                  </pic:nvPicPr>
+                  <pic:blipFill>
+                    <a:blip r:embed="rId11"/>
+                    <a:stretch>
+                      <a:fillRect/>
+                    </a:stretch>
+                  </pic:blipFill>
+                  <pic:spPr>
+                    <a:xfrm>
+                      <a:off x="0" y="0"/>
+                      <a:ext cx="5227319" cy="3929824"/>
+                    </a:xfrm>
+                    <a:prstGeom prst="rect"/>
+                  </pic:spPr>
+                </pic:pic>
+              </a:graphicData>
+            </a:graphic>
+          </wp:inline>
+        </w:drawing>
+      </w:r>
+    </w:p>
+    <w:p>
+      <w:pPr>
+        <w:keepLines/>
+        <w:spacing w:after="86"/>
+        <w:jc w:val="center"/>
+      </w:pPr>
+      <w:r>
+        <w:drawing>
+          <wp:inline xmlns:a="http://schemas.openxmlformats.org/drawingml/2006/main" xmlns:pic="http://schemas.openxmlformats.org/drawingml/2006/picture">
+            <wp:extent cx="5227319" cy="1773555"/>
+            <wp:docPr id="6" name="Picture 6"/>
+            <wp:cNvGraphicFramePr>
+              <a:graphicFrameLocks noChangeAspect="1"/>
+            </wp:cNvGraphicFramePr>
+            <a:graphic>
+              <a:graphicData uri="http://schemas.openxmlformats.org/drawingml/2006/picture">
+                <pic:pic>
+                  <pic:nvPicPr>
+                    <pic:cNvPr id="0" name="c4_1.png"/>
+                    <pic:cNvPicPr/>
+                  </pic:nvPicPr>
+                  <pic:blipFill>
+                    <a:blip r:embed="rId12"/>
+                    <a:stretch>
+                      <a:fillRect/>
+                    </a:stretch>
+                  </pic:blipFill>
+                  <pic:spPr>
+                    <a:xfrm>
+                      <a:off x="0" y="0"/>
+                      <a:ext cx="5227319" cy="1773555"/>
+                    </a:xfrm>
+                    <a:prstGeom prst="rect"/>
+                  </pic:spPr>
+                </pic:pic>
+              </a:graphicData>
+            </a:graphic>
+          </wp:inline>
+        </w:drawing>
+      </w:r>
+    </w:p>
+    <w:p>
+      <w:pPr>
+        <w:keepLines/>
+        <w:spacing w:after="86"/>
+        <w:jc w:val="center"/>
+      </w:pPr>
+      <w:r>
+        <w:drawing>
+          <wp:inline xmlns:a="http://schemas.openxmlformats.org/drawingml/2006/main" xmlns:pic="http://schemas.openxmlformats.org/drawingml/2006/picture">
+            <wp:extent cx="5227319" cy="1969579"/>
+            <wp:docPr id="7" name="Picture 7"/>
+            <wp:cNvGraphicFramePr>
+              <a:graphicFrameLocks noChangeAspect="1"/>
+            </wp:cNvGraphicFramePr>
+            <a:graphic>
+              <a:graphicData uri="http://schemas.openxmlformats.org/drawingml/2006/picture">
+                <pic:pic>
+                  <pic:nvPicPr>
+                    <pic:cNvPr id="0" name="c4_2.png"/>
+                    <pic:cNvPicPr/>
+                  </pic:nvPicPr>
+                  <pic:blipFill>
+                    <a:blip r:embed="rId13"/>
+                    <a:stretch>
+                      <a:fillRect/>
+                    </a:stretch>
+                  </pic:blipFill>
+                  <pic:spPr>
+                    <a:xfrm>
+                      <a:off x="0" y="0"/>
+                      <a:ext cx="5227319" cy="1969579"/>
+                    </a:xfrm>
+                    <a:prstGeom prst="rect"/>
+                  </pic:spPr>
+                </pic:pic>
+              </a:graphicData>
+            </a:graphic>
+          </wp:inline>
+        </w:drawing>
       </w:r>
     </w:p>
     <w:p>
@@ -4200,93 +3197,43 @@
     </w:p>
     <w:p>
       <w:pPr>
-        <w:shd w:val="clear" w:color="auto" w:fill="F2F2F2"/>
-      </w:pPr>
-      <w:r>
-        <w:rPr>
-          <w:rFonts w:ascii="Consolas" w:eastAsia="Consolas" w:hAnsi="Consolas" w:cs="Consolas"/>
-          <w:sz w:val="19"/>
-          <w:szCs w:val="19"/>
-        </w:rPr>
-        <w:t>function item6(a){</w:t>
-      </w:r>
-    </w:p>
-    <w:p>
-      <w:pPr>
-        <w:shd w:val="clear" w:color="auto" w:fill="F2F2F2"/>
-      </w:pPr>
-      <w:r>
-        <w:rPr>
-          <w:rFonts w:ascii="Consolas" w:eastAsia="Consolas" w:hAnsi="Consolas" w:cs="Consolas"/>
-          <w:sz w:val="19"/>
-          <w:szCs w:val="19"/>
-        </w:rPr>
-        <w:t xml:space="preserve">    for (let i=1; i&lt;a.length-1; i++){</w:t>
-      </w:r>
-    </w:p>
-    <w:p>
-      <w:pPr>
-        <w:shd w:val="clear" w:color="auto" w:fill="F2F2F2"/>
-      </w:pPr>
-      <w:r>
-        <w:rPr>
-          <w:rFonts w:ascii="Consolas" w:eastAsia="Consolas" w:hAnsi="Consolas" w:cs="Consolas"/>
-          <w:sz w:val="19"/>
-          <w:szCs w:val="19"/>
-        </w:rPr>
-        <w:t xml:space="preserve">        for (let j=0; j&lt;Math.trunc(Math.log2(a.length)); j++){</w:t>
-      </w:r>
-    </w:p>
-    <w:p>
-      <w:pPr>
-        <w:shd w:val="clear" w:color="auto" w:fill="F2F2F2"/>
-      </w:pPr>
-      <w:r>
-        <w:rPr>
-          <w:rFonts w:ascii="Consolas" w:eastAsia="Consolas" w:hAnsi="Consolas" w:cs="Consolas"/>
-          <w:sz w:val="19"/>
-          <w:szCs w:val="19"/>
-        </w:rPr>
-        <w:t xml:space="preserve">            console.log(a[i]+'  '+a[j]);</w:t>
-      </w:r>
-    </w:p>
-    <w:p>
-      <w:pPr>
-        <w:shd w:val="clear" w:color="auto" w:fill="F2F2F2"/>
-      </w:pPr>
-      <w:r>
-        <w:rPr>
-          <w:rFonts w:ascii="Consolas" w:eastAsia="Consolas" w:hAnsi="Consolas" w:cs="Consolas"/>
-          <w:sz w:val="19"/>
-          <w:szCs w:val="19"/>
-        </w:rPr>
-        <w:t xml:space="preserve">        }</w:t>
-      </w:r>
-    </w:p>
-    <w:p>
-      <w:pPr>
-        <w:shd w:val="clear" w:color="auto" w:fill="F2F2F2"/>
-      </w:pPr>
-      <w:r>
-        <w:rPr>
-          <w:rFonts w:ascii="Consolas" w:eastAsia="Consolas" w:hAnsi="Consolas" w:cs="Consolas"/>
-          <w:sz w:val="19"/>
-          <w:szCs w:val="19"/>
-        </w:rPr>
-        <w:t xml:space="preserve">    }</w:t>
-      </w:r>
-    </w:p>
-    <w:p>
-      <w:pPr>
-        <w:shd w:val="clear" w:color="auto" w:fill="F2F2F2"/>
-      </w:pPr>
-      <w:r>
-        <w:rPr>
-          <w:rFonts w:ascii="Consolas" w:eastAsia="Consolas" w:hAnsi="Consolas" w:cs="Consolas"/>
-          <w:sz w:val="19"/>
-          <w:szCs w:val="19"/>
-        </w:rPr>
-        <w:t>}</w:t>
+        <w:keepLines/>
+        <w:spacing w:after="86"/>
+        <w:jc w:val="center"/>
+      </w:pPr>
+      <w:r>
+        <w:drawing>
+          <wp:inline xmlns:a="http://schemas.openxmlformats.org/drawingml/2006/main" xmlns:pic="http://schemas.openxmlformats.org/drawingml/2006/picture">
+            <wp:extent cx="5227319" cy="1969579"/>
+            <wp:docPr id="8" name="Picture 8"/>
+            <wp:cNvGraphicFramePr>
+              <a:graphicFrameLocks noChangeAspect="1"/>
+            </wp:cNvGraphicFramePr>
+            <a:graphic>
+              <a:graphicData uri="http://schemas.openxmlformats.org/drawingml/2006/picture">
+                <pic:pic>
+                  <pic:nvPicPr>
+                    <pic:cNvPr id="0" name="c5_0.png"/>
+                    <pic:cNvPicPr/>
+                  </pic:nvPicPr>
+                  <pic:blipFill>
+                    <a:blip r:embed="rId14"/>
+                    <a:stretch>
+                      <a:fillRect/>
+                    </a:stretch>
+                  </pic:blipFill>
+                  <pic:spPr>
+                    <a:xfrm>
+                      <a:off x="0" y="0"/>
+                      <a:ext cx="5227319" cy="1969579"/>
+                    </a:xfrm>
+                    <a:prstGeom prst="rect"/>
+                  </pic:spPr>
+                </pic:pic>
+              </a:graphicData>
+            </a:graphic>
+          </wp:inline>
+        </w:drawing>
       </w:r>
     </w:p>
     <w:p>
@@ -4319,224 +3266,43 @@
     </w:p>
     <w:p>
       <w:pPr>
-        <w:shd w:val="clear" w:color="auto" w:fill="F2F2F2"/>
-      </w:pPr>
-      <w:r>
-        <w:rPr>
-          <w:rFonts w:ascii="Consolas" w:eastAsia="Consolas" w:hAnsi="Consolas" w:cs="Consolas"/>
-          <w:sz w:val="19"/>
-          <w:szCs w:val="19"/>
-        </w:rPr>
-        <w:t>function opera(b,c){</w:t>
-      </w:r>
-    </w:p>
-    <w:p>
-      <w:pPr>
-        <w:shd w:val="clear" w:color="auto" w:fill="F2F2F2"/>
-      </w:pPr>
-      <w:r>
-        <w:rPr>
-          <w:rFonts w:ascii="Consolas" w:eastAsia="Consolas" w:hAnsi="Consolas" w:cs="Consolas"/>
-          <w:sz w:val="19"/>
-          <w:szCs w:val="19"/>
-        </w:rPr>
-        <w:t xml:space="preserve">    let veces = 0;</w:t>
-      </w:r>
-    </w:p>
-    <w:p>
-      <w:pPr>
-        <w:shd w:val="clear" w:color="auto" w:fill="F2F2F2"/>
-      </w:pPr>
-      <w:r>
-        <w:rPr>
-          <w:rFonts w:ascii="Consolas" w:eastAsia="Consolas" w:hAnsi="Consolas" w:cs="Consolas"/>
-          <w:sz w:val="19"/>
-          <w:szCs w:val="19"/>
-        </w:rPr>
-        <w:t xml:space="preserve">    for (let x=b; x&lt;=c; x++ )</w:t>
-      </w:r>
-    </w:p>
-    <w:p>
-      <w:pPr>
-        <w:shd w:val="clear" w:color="auto" w:fill="F2F2F2"/>
-      </w:pPr>
-      <w:r>
-        <w:rPr>
-          <w:rFonts w:ascii="Consolas" w:eastAsia="Consolas" w:hAnsi="Consolas" w:cs="Consolas"/>
-          <w:sz w:val="19"/>
-          <w:szCs w:val="19"/>
-        </w:rPr>
-        <w:t xml:space="preserve">    {</w:t>
-      </w:r>
-    </w:p>
-    <w:p>
-      <w:pPr>
-        <w:shd w:val="clear" w:color="auto" w:fill="F2F2F2"/>
-      </w:pPr>
-      <w:r>
-        <w:rPr>
-          <w:rFonts w:ascii="Consolas" w:eastAsia="Consolas" w:hAnsi="Consolas" w:cs="Consolas"/>
-          <w:sz w:val="19"/>
-          <w:szCs w:val="19"/>
-        </w:rPr>
-        <w:lastRenderedPageBreak/>
-        <w:t xml:space="preserve">        if (item2(x))</w:t>
-      </w:r>
-    </w:p>
-    <w:p>
-      <w:pPr>
-        <w:shd w:val="clear" w:color="auto" w:fill="F2F2F2"/>
-      </w:pPr>
-      <w:r>
-        <w:rPr>
-          <w:rFonts w:ascii="Consolas" w:eastAsia="Consolas" w:hAnsi="Consolas" w:cs="Consolas"/>
-          <w:sz w:val="19"/>
-          <w:szCs w:val="19"/>
-        </w:rPr>
-        <w:t xml:space="preserve">        {</w:t>
-      </w:r>
-    </w:p>
-    <w:p>
-      <w:pPr>
-        <w:shd w:val="clear" w:color="auto" w:fill="F2F2F2"/>
-      </w:pPr>
-      <w:r>
-        <w:rPr>
-          <w:rFonts w:ascii="Consolas" w:eastAsia="Consolas" w:hAnsi="Consolas" w:cs="Consolas"/>
-          <w:sz w:val="19"/>
-          <w:szCs w:val="19"/>
-        </w:rPr>
-        <w:t xml:space="preserve">            veces++;</w:t>
-      </w:r>
-    </w:p>
-    <w:p>
-      <w:pPr>
-        <w:shd w:val="clear" w:color="auto" w:fill="F2F2F2"/>
-      </w:pPr>
-      <w:r>
-        <w:rPr>
-          <w:rFonts w:ascii="Consolas" w:eastAsia="Consolas" w:hAnsi="Consolas" w:cs="Consolas"/>
-          <w:sz w:val="19"/>
-          <w:szCs w:val="19"/>
-        </w:rPr>
-        <w:t xml:space="preserve">        }</w:t>
-      </w:r>
-    </w:p>
-    <w:p>
-      <w:pPr>
-        <w:shd w:val="clear" w:color="auto" w:fill="F2F2F2"/>
-      </w:pPr>
-      <w:r>
-        <w:rPr>
-          <w:rFonts w:ascii="Consolas" w:eastAsia="Consolas" w:hAnsi="Consolas" w:cs="Consolas"/>
-          <w:sz w:val="19"/>
-          <w:szCs w:val="19"/>
-        </w:rPr>
-        <w:t xml:space="preserve">    }</w:t>
-      </w:r>
-    </w:p>
-    <w:p>
-      <w:pPr>
-        <w:shd w:val="clear" w:color="auto" w:fill="F2F2F2"/>
-      </w:pPr>
-      <w:r>
-        <w:rPr>
-          <w:rFonts w:ascii="Consolas" w:eastAsia="Consolas" w:hAnsi="Consolas" w:cs="Consolas"/>
-          <w:sz w:val="19"/>
-          <w:szCs w:val="19"/>
-        </w:rPr>
-        <w:t xml:space="preserve">    return veces;</w:t>
-      </w:r>
-    </w:p>
-    <w:p>
-      <w:pPr>
-        <w:shd w:val="clear" w:color="auto" w:fill="F2F2F2"/>
-      </w:pPr>
-      <w:r>
-        <w:rPr>
-          <w:rFonts w:ascii="Consolas" w:eastAsia="Consolas" w:hAnsi="Consolas" w:cs="Consolas"/>
-          <w:sz w:val="19"/>
-          <w:szCs w:val="19"/>
-        </w:rPr>
-        <w:t>}</w:t>
-      </w:r>
-    </w:p>
-    <w:p>
-      <w:pPr>
-        <w:shd w:val="clear" w:color="auto" w:fill="F2F2F2"/>
-      </w:pPr>
-      <w:r>
-        <w:rPr>
-          <w:rFonts w:ascii="Consolas" w:eastAsia="Consolas" w:hAnsi="Consolas" w:cs="Consolas"/>
-          <w:sz w:val="19"/>
-          <w:szCs w:val="19"/>
-        </w:rPr>
-        <w:t xml:space="preserve"> </w:t>
-      </w:r>
-    </w:p>
-    <w:p>
-      <w:pPr>
-        <w:shd w:val="clear" w:color="auto" w:fill="F2F2F2"/>
-      </w:pPr>
-      <w:r>
-        <w:rPr>
-          <w:rFonts w:ascii="Consolas" w:eastAsia="Consolas" w:hAnsi="Consolas" w:cs="Consolas"/>
-          <w:sz w:val="19"/>
-          <w:szCs w:val="19"/>
-        </w:rPr>
-        <w:t>function item7(a){</w:t>
-      </w:r>
-    </w:p>
-    <w:p>
-      <w:pPr>
-        <w:shd w:val="clear" w:color="auto" w:fill="F2F2F2"/>
-      </w:pPr>
-      <w:r>
-        <w:rPr>
-          <w:rFonts w:ascii="Consolas" w:eastAsia="Consolas" w:hAnsi="Consolas" w:cs="Consolas"/>
-          <w:sz w:val="19"/>
-          <w:szCs w:val="19"/>
-        </w:rPr>
-        <w:t xml:space="preserve">    for (let i=0; i&lt;a.length-1; i++){</w:t>
-      </w:r>
-    </w:p>
-    <w:p>
-      <w:pPr>
-        <w:shd w:val="clear" w:color="auto" w:fill="F2F2F2"/>
-      </w:pPr>
-      <w:r>
-        <w:rPr>
-          <w:rFonts w:ascii="Consolas" w:eastAsia="Consolas" w:hAnsi="Consolas" w:cs="Consolas"/>
-          <w:sz w:val="19"/>
-          <w:szCs w:val="19"/>
-        </w:rPr>
-        <w:t xml:space="preserve">        a[i] = opera( i , a.length-1)</w:t>
-      </w:r>
-    </w:p>
-    <w:p>
-      <w:pPr>
-        <w:shd w:val="clear" w:color="auto" w:fill="F2F2F2"/>
-      </w:pPr>
-      <w:r>
-        <w:rPr>
-          <w:rFonts w:ascii="Consolas" w:eastAsia="Consolas" w:hAnsi="Consolas" w:cs="Consolas"/>
-          <w:sz w:val="19"/>
-          <w:szCs w:val="19"/>
-        </w:rPr>
-        <w:t xml:space="preserve">    }</w:t>
-      </w:r>
-    </w:p>
-    <w:p>
-      <w:pPr>
-        <w:shd w:val="clear" w:color="auto" w:fill="F2F2F2"/>
-      </w:pPr>
-      <w:r>
-        <w:rPr>
-          <w:rFonts w:ascii="Consolas" w:eastAsia="Consolas" w:hAnsi="Consolas" w:cs="Consolas"/>
-          <w:sz w:val="19"/>
-          <w:szCs w:val="19"/>
-        </w:rPr>
-        <w:t>}</w:t>
+        <w:keepLines/>
+        <w:spacing w:after="86"/>
+        <w:jc w:val="center"/>
+      </w:pPr>
+      <w:r>
+        <w:drawing>
+          <wp:inline xmlns:a="http://schemas.openxmlformats.org/drawingml/2006/main" xmlns:pic="http://schemas.openxmlformats.org/drawingml/2006/picture">
+            <wp:extent cx="5227319" cy="3929824"/>
+            <wp:docPr id="9" name="Picture 9"/>
+            <wp:cNvGraphicFramePr>
+              <a:graphicFrameLocks noChangeAspect="1"/>
+            </wp:cNvGraphicFramePr>
+            <a:graphic>
+              <a:graphicData uri="http://schemas.openxmlformats.org/drawingml/2006/picture">
+                <pic:pic>
+                  <pic:nvPicPr>
+                    <pic:cNvPr id="0" name="c6_0.png"/>
+                    <pic:cNvPicPr/>
+                  </pic:nvPicPr>
+                  <pic:blipFill>
+                    <a:blip r:embed="rId15"/>
+                    <a:stretch>
+                      <a:fillRect/>
+                    </a:stretch>
+                  </pic:blipFill>
+                  <pic:spPr>
+                    <a:xfrm>
+                      <a:off x="0" y="0"/>
+                      <a:ext cx="5227319" cy="3929824"/>
+                    </a:xfrm>
+                    <a:prstGeom prst="rect"/>
+                  </pic:spPr>
+                </pic:pic>
+              </a:graphicData>
+            </a:graphic>
+          </wp:inline>
+        </w:drawing>
       </w:r>
     </w:p>
     <w:p>

</xml_diff>